<commit_message>
DL 405/XXV/2026: passa a designar-se «DL das atividades económicas»
Substitui «CLAE» e «Código do Licenciamento» pela designação «DL das
atividades económicas» (ou «o Anexo», nas referências ao articulado),
nos dois documentos e nos scripts geradores. A palavra «código» é
ambígua neste repositório, onde designa outro diploma.

Co-Authored-By: Claude Opus 5 <noreply@anthropic.com>
Claude-Session: https://claude.ai/code/session_01ETNym69SS49ymutsXowEHk
</commit_message>
<xml_diff>
--- a/DL 405_2026/Ponto1_Venda_animais_DGAV.docx
+++ b/DL 405_2026/Ponto1_Venda_animais_DGAV.docx
@@ -11,7 +11,7 @@
           <w:b/>
           <w:sz w:val="26"/>
         </w:rPr>
-        <w:t>Venda de animais de companhia: a ausência da DGAV no novo Código do Licenciamento</w:t>
+        <w:t>Venda de animais de companhia: a ausência da DGAV no novo DL das atividades económicas</w:t>
       </w:r>
     </w:p>
     <w:p>
@@ -28,12 +28,12 @@
     </w:p>
     <w:p>
       <w:r>
-        <w:t>O projeto aprova o Código do Licenciamento das Atividades Económicas e revoga, na alínea j) do n.º 1 do artigo 8.º, o Decreto-Lei n.º 10/2015, de 16 de janeiro. É a esse diploma que remete o n.º 1 do artigo 3.º do Decreto-Lei n.º 276/2001, de 17 de outubro, quando ressalva «Sem prejuízo do disposto no Decreto-Lei n.º 10/2015, de 16 de janeiro, quanto aos estabelecimentos de comércio a retalho de animais de companhia». Revogado o diploma remetido, o acesso à atividade das lojas que vendem animais vivos passa a estar no novo Código.</w:t>
+        <w:t>O projeto de DL das atividades económicas revoga, na alínea j) do n.º 1 do artigo 8.º, o Decreto-Lei n.º 10/2015, de 16 de janeiro. É a esse diploma que remete o n.º 1 do artigo 3.º do Decreto-Lei n.º 276/2001, de 17 de outubro, quando ressalva «Sem prejuízo do disposto no Decreto-Lei n.º 10/2015, de 16 de janeiro, quanto aos estabelecimentos de comércio a retalho de animais de companhia». Revogado o diploma remetido, o acesso à atividade das lojas que vendem animais vivos passa a estar no novo diploma.</w:t>
       </w:r>
     </w:p>
     <w:p>
       <w:r>
-        <w:t>O Código recolhe essa atividade no n.º 4 do artigo 16.º do seu anexo e sujeita-a a comunicação prévia. No Anexo II, que identifica as entidades intervenientes, correspondem-lhe a câmara municipal como entidade coordenadora, a Direção-Geral da Defesa do Consumidor, Comércio e Serviços como entidade notificada e nenhuma entidade pública consultada. A DGAV não figura em nenhuma das três colunas.</w:t>
+        <w:t>O novo diploma recolhe essa atividade no n.º 4 do artigo 16.º do seu anexo e sujeita-a a comunicação prévia. No Anexo II, que identifica as entidades intervenientes, correspondem-lhe a câmara municipal como entidade coordenadora, a Direção-Geral da Defesa do Consumidor, Comércio e Serviços como entidade notificada e nenhuma entidade pública consultada. A DGAV não figura em nenhuma das três colunas.</w:t>
       </w:r>
     </w:p>
     <w:p>

</xml_diff>